<commit_message>
chore: working on lab
</commit_message>
<xml_diff>
--- a/EllipticCurves/Elliptic_Curves_Gorbachev.docx
+++ b/EllipticCurves/Elliptic_Curves_Gorbachev.docx
@@ -7,6 +7,7 @@
         <w:pStyle w:val="Heading3"/>
         <w:bidi w:val="0"/>
         <w:spacing w:before="140" w:after="120"/>
+        <w:ind w:hanging="0" w:start="0"/>
         <w:jc w:val="start"/>
         <w:rPr/>
       </w:pPr>
@@ -24,6 +25,7 @@
         </w:numPr>
         <w:bidi w:val="0"/>
         <w:spacing w:before="120" w:after="120"/>
+        <w:ind w:hanging="0" w:start="0"/>
         <w:jc w:val="start"/>
         <w:rPr/>
       </w:pPr>
@@ -102,7 +104,23 @@
       </w:pPr>
       <w:r>
         <w:rPr/>
-        <w:t>Уравнение эллиптической кривой:</w:t>
+        <w:t>Уравнение эллиптической кривой:  y</w:t>
+      </w:r>
+      <w:r>
+        <w:rPr/>
+        <w:t>^</w:t>
+      </w:r>
+      <w:r>
+        <w:rPr/>
+        <w:t>2 = x</w:t>
+      </w:r>
+      <w:r>
+        <w:rPr/>
+        <w:t>^</w:t>
+      </w:r>
+      <w:r>
+        <w:rPr/>
+        <w:t>3 + x (mod419)</w:t>
       </w:r>
     </w:p>
     <w:p>
@@ -115,7 +133,17 @@
       </w:pPr>
       <w:r>
         <w:rPr/>
-        <w:t>Подберём одно решение: для каждого значения перебираем от 0 до , пока не получим верное равенство. Перебором находим точку .</w:t>
+        <w:t xml:space="preserve">Подберём одно решение: для каждого значения перебираем от 0 до </w:t>
+      </w:r>
+      <w:r>
+        <w:rPr>
+          <w:lang w:val="en-US"/>
+        </w:rPr>
+        <w:t>p</w:t>
+      </w:r>
+      <w:r>
+        <w:rPr/>
+        <w:t>-1, пока не получим верное равенство. Перебором находим точку P=(2,64).</w:t>
       </w:r>
     </w:p>
     <w:p>
@@ -151,7 +179,7 @@
         <w:gridCol w:w="1038"/>
         <w:gridCol w:w="1038"/>
         <w:gridCol w:w="1038"/>
-        <w:gridCol w:w="1040"/>
+        <w:gridCol w:w="1039"/>
       </w:tblGrid>
       <w:tr>
         <w:trPr/>
@@ -421,7 +449,7 @@
         </w:tc>
         <w:tc>
           <w:tcPr>
-            <w:tcW w:w="1040" w:type="dxa"/>
+            <w:tcW w:w="1039" w:type="dxa"/>
             <w:tcBorders>
               <w:top w:val="single" w:sz="4" w:space="0" w:color="000000"/>
               <w:start w:val="single" w:sz="4" w:space="0" w:color="000000"/>
@@ -733,7 +761,7 @@
         </w:tc>
         <w:tc>
           <w:tcPr>
-            <w:tcW w:w="1040" w:type="dxa"/>
+            <w:tcW w:w="1039" w:type="dxa"/>
             <w:tcBorders>
               <w:top w:val="single" w:sz="4" w:space="0" w:color="000000"/>
               <w:start w:val="single" w:sz="4" w:space="0" w:color="000000"/>
@@ -3141,7 +3169,6 @@
     </w:rPrDefault>
     <w:pPrDefault>
       <w:pPr>
-        <w:widowControl/>
         <w:suppressAutoHyphens w:val="true"/>
       </w:pPr>
     </w:pPrDefault>
@@ -3151,10 +3178,11 @@
     <w:qFormat/>
     <w:pPr>
       <w:widowControl/>
-      <w:kinsoku w:val="true"/>
-      <w:overflowPunct w:val="true"/>
-      <w:autoSpaceDE w:val="true"/>
+      <w:suppressAutoHyphens w:val="true"/>
+      <w:overflowPunct w:val="false"/>
       <w:bidi w:val="0"/>
+      <w:spacing w:before="0" w:after="0"/>
+      <w:jc w:val="start"/>
     </w:pPr>
     <w:rPr>
       <w:rFonts w:ascii="Liberation Serif" w:hAnsi="Liberation Serif" w:eastAsia="Noto Serif CJK SC" w:cs="Noto Sans Devanagari"/>
@@ -3171,10 +3199,6 @@
     <w:next w:val="BodyText"/>
     <w:qFormat/>
     <w:pPr>
-      <w:numPr>
-        <w:ilvl w:val="0"/>
-        <w:numId w:val="0"/>
-      </w:numPr>
       <w:spacing w:before="140" w:after="120"/>
       <w:outlineLvl w:val="2"/>
     </w:pPr>
@@ -3192,10 +3216,6 @@
     <w:next w:val="BodyText"/>
     <w:qFormat/>
     <w:pPr>
-      <w:numPr>
-        <w:ilvl w:val="0"/>
-        <w:numId w:val="0"/>
-      </w:numPr>
       <w:spacing w:before="120" w:after="120"/>
       <w:outlineLvl w:val="3"/>
     </w:pPr>

</xml_diff>